<commit_message>
Save manuscript edits made while the previous push was running.
Co-authored-by: Cursor <cursoragent@cursor.com>
</commit_message>
<xml_diff>
--- a/Science Books/QED Course/Critical Review of the QED Course.docx
+++ b/Science Books/QED Course/Critical Review of the QED Course.docx
@@ -59,7 +59,7 @@
           <w:color w:val="1A1A1A"/>
           <w:sz w:val="23"/>
         </w:rPr>
-        <w:t>The object under review is the complete Word file, Course edition 1.0, together with the sixty-seven standalone lesson files that match its real chapters. The file contains about 208,000 words, 8,017 paragraphs, and 208 tables, on US Letter pages. Lessons 1 through 67 are written. Lessons 68 through 86, the capstone, and the formula index are still in the file, and they are a different kind of text.</w:t>
+        <w:t>The object under review is the complete Word file, Course edition 1.0, checked against the sixty-seven standalone lesson files and their sources. The complete file contains about 208,000 words, 8,017 paragraphs, and 208 tables, on US Letter pages, and it contains zero pictures and zero hyperlinks. Lessons 1 through 61 in that file are the written course. Lessons 62 through 86 are one template with the topic name swapped in. Standalone files for Lessons 62 through 67 do exist, and they are real lessons, and they are not the chapters a reader finds in the complete book.</w:t>
       </w:r>
     </w:p>
     <w:p>
@@ -90,7 +90,7 @@
           <w:color w:val="1A1A1A"/>
           <w:sz w:val="23"/>
         </w:rPr>
-        <w:t>Read as a course of instruction through tree-level scattering and the idea of mass renormalization, this is serious work. The sequence is a sequence. The factors of i and e are derived rather than announced. The massless Compton result and the two-body formula for dσ/dΩ agree with the standard answers. A reader who does Lessons 1 through 67 with a pencil will know how a QED cross section is built.</w:t>
+        <w:t>Read as a course of instruction through tree-level scattering, the sources are serious work. The sequence is a sequence. The factors of i and e are derived rather than announced. The massless Compton result and the two-body formula for dσ/dΩ agree with the standard answers. A reader who works the standalone lessons through Lesson 67 with a pencil will know how a QED cross section is built, and will have seen a cutoff and a mass renormalization. A reader who opens only the complete file stops at Lesson 61, on the threshold of vacuum polarization, and then reads templates.</w:t>
       </w:r>
     </w:p>
     <w:p>
@@ -105,7 +105,7 @@
           <w:color w:val="1A1A1A"/>
           <w:sz w:val="23"/>
         </w:rPr>
-        <w:t>Read as a book, the same file is not ready. The subtitle promises precision QED. The last nineteen lessons do not deliver it. They are one template with the topic name swapped in. Earlier chapters cite those lessons by number for the Ward identity, the running charge, the anomalous magnetic moment, the Lamb shift, the path integral, and pair production in an external field. A buyer who believes the citation arrives at a page that says, in substance, define the essential objects and derive the central relation, and then never states a relation worth deriving.</w:t>
+        <w:t>Read as a book, the complete file is not ready. The subtitle promises precision QED. From Lesson 62 onward the file does not deliver a derivation. Earlier chapters cite later lessons by number for the Ward identity, the running charge, the anomalous magnetic moment, the Lamb shift, the path integral, and pair production in an external field. A buyer who believes the citation arrives at a page that says, in substance, define the essential objects and derive the central relation, and then never states a relation worth deriving. The same buyer never meets the written Lessons 62 through 67, because those files were not spliced into the complete book.</w:t>
       </w:r>
     </w:p>
     <w:p>
@@ -120,7 +120,7 @@
           <w:color w:val="1A1A1A"/>
           <w:sz w:val="23"/>
         </w:rPr>
-        <w:t>That gap decides the rest of the report. The manuscript’s strength is the path from complex numbers to a cross section. Its failure, as a published book, is that it continues past the path it has actually built, in a voice and a format that hide the difference. Overall, as the book a reader would be handed today, it is a 4 out of 10. The written lessons alone, judged as a course manuscript and not as a product, are a 7.</w:t>
+        <w:t>That gap decides the rest of the report. The manuscript’s strength is the path from complex numbers to a cross section. Its failure, as a published book, is that the complete file parts company with the written lessons at Lesson 62 and continues in a template that hides the difference. Overall, as the book a reader would be handed today, it is a 3 out of 10. The written lessons alone, judged as a course manuscript and not as the file that contains them, are a 7.</w:t>
       </w:r>
     </w:p>
     <w:p>
@@ -152,6 +152,11 @@
           <w:sz w:val="23"/>
         </w:rPr>
         <w:t>Each score is out of ten. The third column is the change that would move the score, not a compliment placed beside the number.</w:t>
+      </w:r>
+    </w:p>
+    <w:p>
+      <w:r>
+        <w:br w:type="page"/>
       </w:r>
     </w:p>
     <w:tbl>
@@ -1449,7 +1454,7 @@
                 <w:color w:val="1A1A1A"/>
                 <w:sz w:val="21"/>
               </w:rPr>
-              <w:t>2</w:t>
+              <w:t>1</w:t>
             </w:r>
           </w:p>
         </w:tc>
@@ -1477,7 +1482,7 @@
                 <w:color w:val="1A1A1A"/>
                 <w:sz w:val="21"/>
               </w:rPr>
-              <w:t>Remove Lessons 68–86 until they are real, and rewrite every pointer to them.</w:t>
+              <w:t>Splice the written Lessons 62–67 into the complete file, and remove 68–86 until they are real.</w:t>
             </w:r>
           </w:p>
         </w:tc>
@@ -1799,7 +1804,7 @@
                 <w:color w:val="1A1A1A"/>
                 <w:sz w:val="21"/>
               </w:rPr>
-              <w:t>4</w:t>
+              <w:t>3</w:t>
             </w:r>
           </w:p>
         </w:tc>
@@ -1850,7 +1855,7 @@
           <w:color w:val="1A1A1A"/>
           <w:sz w:val="23"/>
         </w:rPr>
-        <w:t>The 9 is not politeness. Very few single-author manuscripts actually walk from the complex numbers to five spin-summed amplitudes without changing the rules halfway. That achievement is currently carrying a file that also contains nineteen chapters a reviewer can tell were generated from one paragraph.</w:t>
+        <w:t>The 9 is not politeness. Very few single-author manuscripts actually walk from the complex numbers to five spin-summed amplitudes without changing the rules halfway. That achievement is currently carrying a complete file in which twenty-five chapters, Lessons 62 through 86, are the same generated paragraph with a new noun.</w:t>
       </w:r>
     </w:p>
     <w:p>
@@ -1896,7 +1901,7 @@
           <w:color w:val="1A1A1A"/>
           <w:sz w:val="23"/>
         </w:rPr>
-        <w:t>Lesson 67 is the last chapter with a derivation in it. It shows how a divergence in the electron’s self-energy can be absorbed into a bare mass that nobody measures. Its last note sends the reader to Lesson 68 for the same argument applied to charge. Lesson 43 tells the reader that α/(2π) is Schwinger’s result for (g−2)/2 and that the derivation is Lesson 75. Lesson 39 postpones the Dirac g = 2 reduction to that same lesson. Lesson 47 and Lesson 51 postpone the Ward identity to Lesson 71. Lesson 62 postpones the running charge to Lesson 68 and the general proof of transversality to Lesson 71. Lesson 3 postpones the hydrogen hierarchy to Lesson 76. Lesson 15 postpones the Lamb shift to Lesson 76 and the “one part in a billion” to Lesson 78. Lesson 11 and Lesson 2 postpone the path integral to Lesson 79. Lesson 57 postpones an external field to Lesson 85.</w:t>
+        <w:t>An audit of headings in the complete file settles where the real book ends. Lessons 1 through 61 have the working shape: objectives, a notation table, numbered sections, worked examples, exercises, solutions, a mastery checklist. From Lesson 62, Vacuum Polarization, through Lesson 86, every chapter has the same eight headings and no others: Learning objectives, Core statement, Development, Derivation workflow, Worked checkpoint, QED connection, Exercises, Solution guidance. Lesson 66’s core statement in that file is “d = 4 − 2ε in dimensional regularization.” The standalone Lesson 66, which the complete file does not contain, teaches a momentum cutoff Λ and never uses that phrase. Lesson 67’s source shows how a divergence in the electron’s self-energy can be absorbed into a bare mass. The complete file’s Lesson 67 does not.</w:t>
       </w:r>
     </w:p>
     <w:p>
@@ -1911,7 +1916,22 @@
           <w:color w:val="1A1A1A"/>
           <w:sz w:val="23"/>
         </w:rPr>
-        <w:t>Those chapters are present, and they are empty in a specific way. Lesson 68, Running Electric Charge, opens: “This lesson develops running electric charge as part of the path from elementary mathematics to quantum electrodynamics.” The objectives are “define the essential objects,” “derive the central relation,” and “recognize how the result enters later calculations.” The core statement displayed for the lesson is the tautology e = e(μ). The exercises, numbered in the four hundreds, ask the reader to derive that relation and to “construct a simple example.” The same skeleton, with the noun replaced, is Lesson 69 through Lesson 86: the renormalization group, gauge fixing, the Ward identities, gauge invariance, infrared divergences, soft photons, the anomalous magnetic moment, the Lamb shift, precision tests, path integrals, generating functionals, effective actions, finite temperature, external fields, and the Standard Model.</w:t>
+        <w:t>The sources still point past themselves. Lesson 43 says that α/(2π) is Schwinger’s result for (g−2)/2 and that the derivation is Lesson 75. Lesson 39 postpones the Dirac g = 2 reduction to that same lesson. Lessons 47 and 51 postpone the Ward identity to Lesson 71. The written Lesson 62 postpones the running charge to Lesson 68. Lesson 3 postpones the hydrogen hierarchy to Lesson 76. Lesson 15 postpones the Lamb shift to Lesson 76 and the “one part in a billion” to Lesson 78. Lessons 2 and 11 postpone the path integral to Lesson 79. Lesson 57 postpones an external field to Lesson 85. None of those landing pages exist as lessons. In the complete file, the reader cannot even reach the written versions of Lessons 62 through 67, which are the last real steps before those citations.</w:t>
+      </w:r>
+    </w:p>
+    <w:p>
+      <w:pPr>
+        <w:spacing w:before="0" w:after="160" w:line="269" w:lineRule="auto"/>
+      </w:pPr>
+      <w:r>
+        <w:rPr>
+          <w:rFonts w:ascii="Cambria" w:hAnsi="Cambria" w:cs="Cambria" w:eastAsia="Cambria"/>
+          <w:b w:val="0"/>
+          <w:i w:val="0"/>
+          <w:color w:val="1A1A1A"/>
+          <w:sz w:val="23"/>
+        </w:rPr>
+        <w:t>The template is empty in a specific way. Lesson 68, Running Electric Charge, opens: “This lesson develops running electric charge as part of the path from elementary mathematics to quantum electrodynamics.” The objectives are “define the essential objects,” “derive the central relation,” and “recognize how the result enters later calculations.” The exercises ask the reader to derive that relation and to construct a simple example, without a relation on the page worth deriving. The same skeleton, with the noun replaced, runs through gauge fixing, the Ward identities, infrared divergences, soft photons, the anomalous magnetic moment, the Lamb shift, precision tests, path integrals, finite temperature, external fields, and the Standard Model.</w:t>
       </w:r>
     </w:p>
     <w:p>
@@ -1941,7 +1961,7 @@
           <w:color w:val="1A1A1A"/>
           <w:sz w:val="23"/>
         </w:rPr>
-        <w:t>The capstone is one paragraph. It asks the reader to walk from a free Dirac field to a one-loop remark, and it stops before every result the subtitle advertised. The consolidated formula index is one line per lesson. Several of those lines describe a book this file does not contain. The regularization line cites dimensional regularization and d = 4 − 2ε. Lesson 66 teaches a momentum cutoff Λ, and it says so. An index that contradicts the chapter is worse than no index, because a returning reader will trust the index.</w:t>
+        <w:t>The capstone is one paragraph. It asks the reader to walk from a free Dirac field to a one-loop remark, and it stops before every result the subtitle advertised. The consolidated formula index is one line per lesson, and it describes the template’s slogans rather than the lessons that were written. It cites dimensional regularization. The written Lesson 66 uses a cutoff. The index gives the electron-photon vertex as −ieγμ. Lesson 44 derives +ieγμ and says the sign was checked. An index that contradicts both the chapter in the file and the chapter on disk is worse than no index, because a returning reader will trust the index.</w:t>
       </w:r>
     </w:p>
     <w:p>
@@ -2849,7 +2869,7 @@
           <w:color w:val="1A1A1A"/>
           <w:sz w:val="23"/>
         </w:rPr>
-        <w:t>Delete Lessons 68 through 86 from the reader-facing book. Keep the source notes for a second volume if you want them, outside this file. Rewrite the capstone so it describes the chain the volume actually completes, and stop.</w:t>
+        <w:t>Decide which file is the book. Splice the written Lessons 62 through 67 into the complete file, or stop the complete file at Lesson 61 and say so. Delete Lessons 68 through 86 from anything a reader can open. Rewrite the capstone so it describes the chain that file actually completes.</w:t>
       </w:r>
     </w:p>
     <w:p>

</xml_diff>